<commit_message>
docs(SRS): Updated SRS                                                                                                                                                            The document was modified to align with the product scope regarding the manual entry of consumption thresholds versus the use of predefined thresholds, the change of the data transfer protocol from HTTP to MQTT, and the restriction of the product scope exclusively to mobile devices running the Android operating system.
</commit_message>
<xml_diff>
--- a/SRS.docx
+++ b/SRS.docx
@@ -2492,7 +2492,19 @@
         <w:rPr>
           <w:color w:val="000000"/>
         </w:rPr>
-        <w:t>- Permitir la generación de reportes periódicos sobre el uso de energía, que ayuden a los usuarios a tomar decisiones    informadas para reducir su consumo.</w:t>
+        <w:t>- Permitir la generación de reportes periódicos sobre el uso de energía, que ayuden a l</w:t>
+      </w:r>
+      <w:r>
+        <w:rPr>
+          <w:color w:val="000000"/>
+        </w:rPr>
+        <w:t>os usuarios a tomar decisiones</w:t>
+      </w:r>
+      <w:r>
+        <w:rPr>
+          <w:color w:val="000000"/>
+        </w:rPr>
+        <w:t xml:space="preserve"> para reducir su consumo.</w:t>
       </w:r>
     </w:p>
     <w:p>
@@ -2600,13 +2612,13 @@
         <w:rPr>
           <w:color w:val="000000"/>
         </w:rPr>
-        <w:t>1.5.1. Una aplicación que permita a los usuarios registrar y monitorear su con</w:t>
+        <w:t xml:space="preserve">1.5.1. </w:t>
       </w:r>
       <w:r>
         <w:rPr>
           <w:color w:val="000000"/>
         </w:rPr>
-        <w:t>sumo eléctrico de forma manual.</w:t>
+        <w:t xml:space="preserve"> Una aplicación que permite a los usuarios registrar umbrales de consumo o establecer umbrales predeterminados y supervisar manualmente su consumo de electricidad.</w:t>
       </w:r>
     </w:p>
     <w:p>
@@ -4402,24 +4414,20 @@
         <w:rPr>
           <w:color w:val="000000"/>
         </w:rPr>
-        <w:t>La aplicación está dividida en cuatro secciones principales:</w:t>
+        <w:t>La aplicación e</w:t>
       </w:r>
-    </w:p>
-    <w:p>
-      <w:pPr>
-        <w:pBdr>
-          <w:top w:val="nil"/>
-          <w:left w:val="nil"/>
-          <w:bottom w:val="nil"/>
-          <w:right w:val="nil"/>
-          <w:between w:val="nil"/>
-        </w:pBdr>
-        <w:spacing w:before="62" w:line="480" w:lineRule="auto"/>
-        <w:ind w:left="720" w:right="1321" w:firstLine="720"/>
+      <w:r>
         <w:rPr>
           <w:color w:val="000000"/>
         </w:rPr>
-      </w:pPr>
+        <w:t>stá dividida en tres</w:t>
+      </w:r>
+      <w:r>
+        <w:rPr>
+          <w:color w:val="000000"/>
+        </w:rPr>
+        <w:t xml:space="preserve"> secciones principales:</w:t>
+      </w:r>
     </w:p>
     <w:p>
       <w:pPr>
@@ -4752,7 +4760,6 @@
                 <w:bCs/>
                 <w:color w:val="000000"/>
               </w:rPr>
-              <w:lastRenderedPageBreak/>
               <w:t>Formación</w:t>
             </w:r>
           </w:p>
@@ -4816,6 +4823,7 @@
                 <w:bCs/>
                 <w:color w:val="000000"/>
               </w:rPr>
+              <w:lastRenderedPageBreak/>
               <w:t>Actividades</w:t>
             </w:r>
           </w:p>
@@ -4859,40 +4867,6 @@
           <w:between w:val="nil"/>
         </w:pBdr>
         <w:spacing w:line="480" w:lineRule="auto"/>
-        <w:rPr>
-          <w:b/>
-          <w:bCs/>
-          <w:color w:val="000000"/>
-        </w:rPr>
-      </w:pPr>
-    </w:p>
-    <w:p>
-      <w:pPr>
-        <w:pBdr>
-          <w:top w:val="nil"/>
-          <w:left w:val="nil"/>
-          <w:bottom w:val="nil"/>
-          <w:right w:val="nil"/>
-          <w:between w:val="nil"/>
-        </w:pBdr>
-        <w:spacing w:before="44" w:after="1" w:line="480" w:lineRule="auto"/>
-        <w:rPr>
-          <w:b/>
-          <w:bCs/>
-          <w:color w:val="000000"/>
-        </w:rPr>
-      </w:pPr>
-    </w:p>
-    <w:p>
-      <w:pPr>
-        <w:pBdr>
-          <w:top w:val="nil"/>
-          <w:left w:val="nil"/>
-          <w:bottom w:val="nil"/>
-          <w:right w:val="nil"/>
-          <w:between w:val="nil"/>
-        </w:pBdr>
-        <w:spacing w:before="1" w:after="1" w:line="480" w:lineRule="auto"/>
         <w:rPr>
           <w:b/>
           <w:bCs/>
@@ -4978,7 +4952,33 @@
               <w:rPr>
                 <w:color w:val="000000"/>
               </w:rPr>
-              <w:t>Usuario común</w:t>
+              <w:t>Propietario de vivienda</w:t>
+            </w:r>
+            <w:r>
+              <w:rPr>
+                <w:color w:val="000000"/>
+              </w:rPr>
+              <w:t xml:space="preserve"> </w:t>
+            </w:r>
+            <w:r>
+              <w:rPr>
+                <w:color w:val="000000"/>
+              </w:rPr>
+              <w:t xml:space="preserve">(Home </w:t>
+            </w:r>
+            <w:proofErr w:type="spellStart"/>
+            <w:r>
+              <w:rPr>
+                <w:color w:val="000000"/>
+              </w:rPr>
+              <w:t>Owner</w:t>
+            </w:r>
+            <w:proofErr w:type="spellEnd"/>
+            <w:r>
+              <w:rPr>
+                <w:color w:val="000000"/>
+              </w:rPr>
+              <w:t>)</w:t>
             </w:r>
           </w:p>
         </w:tc>
@@ -5041,7 +5041,7 @@
               <w:rPr>
                 <w:color w:val="000000"/>
               </w:rPr>
-              <w:t>Natural</w:t>
+              <w:t>Administrador del hogar.</w:t>
             </w:r>
           </w:p>
         </w:tc>
@@ -5104,6 +5104,270 @@
               <w:rPr>
                 <w:color w:val="000000"/>
               </w:rPr>
+              <w:t>Persona responsable de gestionar un hogar, incluida la gestión de dispositivos y usuarios vinculados.</w:t>
+            </w:r>
+          </w:p>
+        </w:tc>
+      </w:tr>
+    </w:tbl>
+    <w:p>
+      <w:pPr>
+        <w:pBdr>
+          <w:top w:val="nil"/>
+          <w:left w:val="nil"/>
+          <w:bottom w:val="nil"/>
+          <w:right w:val="nil"/>
+          <w:between w:val="nil"/>
+        </w:pBdr>
+        <w:spacing w:before="44" w:after="1" w:line="480" w:lineRule="auto"/>
+        <w:rPr>
+          <w:b/>
+          <w:bCs/>
+          <w:color w:val="000000"/>
+        </w:rPr>
+      </w:pPr>
+    </w:p>
+    <w:p>
+      <w:pPr>
+        <w:pBdr>
+          <w:top w:val="nil"/>
+          <w:left w:val="nil"/>
+          <w:bottom w:val="nil"/>
+          <w:right w:val="nil"/>
+          <w:between w:val="nil"/>
+        </w:pBdr>
+        <w:spacing w:before="1" w:after="1" w:line="480" w:lineRule="auto"/>
+        <w:rPr>
+          <w:b/>
+          <w:bCs/>
+          <w:color w:val="000000"/>
+        </w:rPr>
+      </w:pPr>
+    </w:p>
+    <w:tbl>
+      <w:tblPr>
+        <w:tblStyle w:val="affff2"/>
+        <w:tblW w:w="7940" w:type="dxa"/>
+        <w:tblInd w:w="1575" w:type="dxa"/>
+        <w:tblBorders>
+          <w:top w:val="single" w:sz="4" w:space="0" w:color="000000"/>
+          <w:left w:val="single" w:sz="4" w:space="0" w:color="000000"/>
+          <w:bottom w:val="single" w:sz="4" w:space="0" w:color="000000"/>
+          <w:right w:val="single" w:sz="4" w:space="0" w:color="000000"/>
+          <w:insideH w:val="single" w:sz="4" w:space="0" w:color="000000"/>
+          <w:insideV w:val="single" w:sz="4" w:space="0" w:color="000000"/>
+        </w:tblBorders>
+        <w:tblLayout w:type="fixed"/>
+        <w:tblLook w:val="0000" w:firstRow="0" w:lastRow="0" w:firstColumn="0" w:lastColumn="0" w:noHBand="0" w:noVBand="0"/>
+      </w:tblPr>
+      <w:tblGrid>
+        <w:gridCol w:w="1985"/>
+        <w:gridCol w:w="5955"/>
+      </w:tblGrid>
+      <w:tr>
+        <w:trPr>
+          <w:trHeight w:val="388"/>
+        </w:trPr>
+        <w:tc>
+          <w:tcPr>
+            <w:tcW w:w="1985" w:type="dxa"/>
+          </w:tcPr>
+          <w:p>
+            <w:pPr>
+              <w:pBdr>
+                <w:top w:val="nil"/>
+                <w:left w:val="nil"/>
+                <w:bottom w:val="nil"/>
+                <w:right w:val="nil"/>
+                <w:between w:val="nil"/>
+              </w:pBdr>
+              <w:spacing w:before="121" w:line="480" w:lineRule="auto"/>
+              <w:ind w:left="119"/>
+              <w:rPr>
+                <w:b/>
+                <w:bCs/>
+                <w:color w:val="000000"/>
+              </w:rPr>
+            </w:pPr>
+            <w:r>
+              <w:rPr>
+                <w:b/>
+                <w:bCs/>
+                <w:color w:val="000000"/>
+              </w:rPr>
+              <w:t>Nombre de usuario</w:t>
+            </w:r>
+          </w:p>
+        </w:tc>
+        <w:tc>
+          <w:tcPr>
+            <w:tcW w:w="5955" w:type="dxa"/>
+          </w:tcPr>
+          <w:p>
+            <w:pPr>
+              <w:pBdr>
+                <w:top w:val="nil"/>
+                <w:left w:val="nil"/>
+                <w:bottom w:val="nil"/>
+                <w:right w:val="nil"/>
+                <w:between w:val="nil"/>
+              </w:pBdr>
+              <w:spacing w:before="121" w:line="480" w:lineRule="auto"/>
+              <w:ind w:left="117"/>
+              <w:rPr>
+                <w:color w:val="000000"/>
+              </w:rPr>
+            </w:pPr>
+            <w:r>
+              <w:rPr>
+                <w:color w:val="000000"/>
+              </w:rPr>
+              <w:t>Miembro residencial</w:t>
+            </w:r>
+            <w:r>
+              <w:rPr>
+                <w:color w:val="000000"/>
+              </w:rPr>
+              <w:t xml:space="preserve"> (Home </w:t>
+            </w:r>
+            <w:proofErr w:type="spellStart"/>
+            <w:r>
+              <w:rPr>
+                <w:color w:val="000000"/>
+              </w:rPr>
+              <w:t>Member</w:t>
+            </w:r>
+            <w:proofErr w:type="spellEnd"/>
+            <w:r>
+              <w:rPr>
+                <w:color w:val="000000"/>
+              </w:rPr>
+              <w:t>)</w:t>
+            </w:r>
+          </w:p>
+        </w:tc>
+      </w:tr>
+      <w:tr>
+        <w:trPr>
+          <w:trHeight w:val="385"/>
+        </w:trPr>
+        <w:tc>
+          <w:tcPr>
+            <w:tcW w:w="1985" w:type="dxa"/>
+          </w:tcPr>
+          <w:p>
+            <w:pPr>
+              <w:pBdr>
+                <w:top w:val="nil"/>
+                <w:left w:val="nil"/>
+                <w:bottom w:val="nil"/>
+                <w:right w:val="nil"/>
+                <w:between w:val="nil"/>
+              </w:pBdr>
+              <w:spacing w:before="119" w:line="480" w:lineRule="auto"/>
+              <w:ind w:left="119"/>
+              <w:rPr>
+                <w:b/>
+                <w:bCs/>
+                <w:color w:val="000000"/>
+              </w:rPr>
+            </w:pPr>
+            <w:r>
+              <w:rPr>
+                <w:b/>
+                <w:bCs/>
+                <w:color w:val="000000"/>
+              </w:rPr>
+              <w:t>Formación</w:t>
+            </w:r>
+          </w:p>
+        </w:tc>
+        <w:tc>
+          <w:tcPr>
+            <w:tcW w:w="5955" w:type="dxa"/>
+          </w:tcPr>
+          <w:p>
+            <w:pPr>
+              <w:pBdr>
+                <w:top w:val="nil"/>
+                <w:left w:val="nil"/>
+                <w:bottom w:val="nil"/>
+                <w:right w:val="nil"/>
+                <w:between w:val="nil"/>
+              </w:pBdr>
+              <w:spacing w:before="119" w:line="480" w:lineRule="auto"/>
+              <w:ind w:left="117"/>
+              <w:rPr>
+                <w:color w:val="000000"/>
+              </w:rPr>
+            </w:pPr>
+            <w:r>
+              <w:rPr>
+                <w:color w:val="000000"/>
+              </w:rPr>
+              <w:t>Natural</w:t>
+            </w:r>
+          </w:p>
+        </w:tc>
+      </w:tr>
+      <w:tr>
+        <w:trPr>
+          <w:trHeight w:val="1139"/>
+        </w:trPr>
+        <w:tc>
+          <w:tcPr>
+            <w:tcW w:w="1985" w:type="dxa"/>
+          </w:tcPr>
+          <w:p>
+            <w:pPr>
+              <w:pBdr>
+                <w:top w:val="nil"/>
+                <w:left w:val="nil"/>
+                <w:bottom w:val="nil"/>
+                <w:right w:val="nil"/>
+                <w:between w:val="nil"/>
+              </w:pBdr>
+              <w:spacing w:before="119" w:line="480" w:lineRule="auto"/>
+              <w:ind w:left="119"/>
+              <w:rPr>
+                <w:b/>
+                <w:bCs/>
+                <w:color w:val="000000"/>
+              </w:rPr>
+            </w:pPr>
+            <w:r>
+              <w:rPr>
+                <w:b/>
+                <w:bCs/>
+                <w:color w:val="000000"/>
+              </w:rPr>
+              <w:t>Actividades</w:t>
+            </w:r>
+          </w:p>
+        </w:tc>
+        <w:tc>
+          <w:tcPr>
+            <w:tcW w:w="5955" w:type="dxa"/>
+          </w:tcPr>
+          <w:p>
+            <w:pPr>
+              <w:pBdr>
+                <w:top w:val="nil"/>
+                <w:left w:val="nil"/>
+                <w:bottom w:val="nil"/>
+                <w:right w:val="nil"/>
+                <w:between w:val="nil"/>
+              </w:pBdr>
+              <w:spacing w:before="119" w:line="480" w:lineRule="auto"/>
+              <w:ind w:left="114"/>
+              <w:rPr>
+                <w:color w:val="000000"/>
+              </w:rPr>
+            </w:pPr>
+            <w:r>
+              <w:rPr>
+                <w:color w:val="000000"/>
+              </w:rPr>
               <w:t>Interactúa con la aplicación para visualizar información relacionada con su consumo energético. Puede registrar m</w:t>
             </w:r>
             <w:r>
@@ -5118,22 +5382,6 @@
               </w:rPr>
               <w:t xml:space="preserve"> configurar umbrales de gasto y frecuencia de notificaciones, así como acceder a reportes y recomendaciones para optimizar su uso de energía.</w:t>
             </w:r>
-          </w:p>
-          <w:p>
-            <w:pPr>
-              <w:pBdr>
-                <w:top w:val="nil"/>
-                <w:left w:val="nil"/>
-                <w:bottom w:val="nil"/>
-                <w:right w:val="nil"/>
-                <w:between w:val="nil"/>
-              </w:pBdr>
-              <w:spacing w:before="119" w:line="480" w:lineRule="auto"/>
-              <w:ind w:left="117" w:right="471"/>
-              <w:rPr>
-                <w:color w:val="000000"/>
-              </w:rPr>
-            </w:pPr>
           </w:p>
         </w:tc>
       </w:tr>
@@ -5277,7 +5525,7 @@
         <w:rPr>
           <w:color w:val="000000"/>
         </w:rPr>
-        <w:t xml:space="preserve"> El software debe ser compatible con dispositivos móviles Android y iOS, así como con navegadores web actualizados (Chrome, Firefox, Safari, </w:t>
+        <w:t xml:space="preserve"> El software debe ser compatible con dispositivos móviles Android, así como con navegadores web actualizados (Chrome, Firefox, Safari, </w:t>
       </w:r>
       <w:proofErr w:type="spellStart"/>
       <w:r>
@@ -5323,7 +5571,25 @@
         <w:rPr>
           <w:color w:val="000000"/>
         </w:rPr>
-        <w:t xml:space="preserve"> El ingreso manual del consumo depende de la disponibilidad y legibilidad del recibo de energía eléctrica por parte del usuario.</w:t>
+        <w:t xml:space="preserve"> El registro</w:t>
+      </w:r>
+      <w:r>
+        <w:rPr>
+          <w:color w:val="000000"/>
+        </w:rPr>
+        <w:t xml:space="preserve"> </w:t>
+      </w:r>
+      <w:r>
+        <w:rPr>
+          <w:color w:val="000000"/>
+        </w:rPr>
+        <w:t>manual de umbrales de consumo depende de cuanta energía el usuario requiera ahorrar</w:t>
+      </w:r>
+      <w:r>
+        <w:rPr>
+          <w:color w:val="000000"/>
+        </w:rPr>
+        <w:t>.</w:t>
       </w:r>
     </w:p>
     <w:p>
@@ -6087,7 +6353,13 @@
           <w:color w:val="000000"/>
         </w:rPr>
         <w:tab/>
-        <w:t>Sistema Operativo: la última versión disponible de Android y iOS</w:t>
+        <w:t>Sistema Operativo: la última ver</w:t>
+      </w:r>
+      <w:r>
+        <w:rPr>
+          <w:color w:val="000000"/>
+        </w:rPr>
+        <w:t xml:space="preserve">sión disponible de Android </w:t>
       </w:r>
     </w:p>
     <w:p>
@@ -7328,8 +7600,25 @@
         <w:spacing w:after="160"/>
       </w:pPr>
       <w:r>
+        <w:t xml:space="preserve">El dispositivo de medición debe enviar automáticamente los datos de consumo eléctrico (voltaje, corriente, potencia activa y energía acumulada) al sistema a intervalos regulares de 60 </w:t>
+      </w:r>
+      <w:r>
         <w:lastRenderedPageBreak/>
-        <w:t>El dispositivo de medición debe enviar automáticamente los datos de consumo eléctrico (voltaje, corriente, potencia activa y energía acumulada) al sistema a intervalos regulares de 60 segundos mediante protocolo HTTP.</w:t>
+        <w:t>segundos mediante protocolo MQTT</w:t>
+      </w:r>
+      <w:r>
+        <w:t xml:space="preserve">, de modo que el </w:t>
+      </w:r>
+      <w:proofErr w:type="spellStart"/>
+      <w:r>
+        <w:t>Broker</w:t>
+      </w:r>
+      <w:proofErr w:type="spellEnd"/>
+      <w:r>
+        <w:t xml:space="preserve"> pueda transmitir información de consumo a los clientes suscritos</w:t>
+      </w:r>
+      <w:r>
+        <w:t>.</w:t>
       </w:r>
     </w:p>
     <w:p>
@@ -8902,7 +9191,6 @@
                 <w:b/>
                 <w:bCs/>
               </w:rPr>
-              <w:lastRenderedPageBreak/>
               <w:t>Manejo de situaciones anormales</w:t>
             </w:r>
           </w:p>
@@ -8931,8 +9219,6 @@
             <w:r>
               <w:t>Dispositivo ya vinculado a otro proyecto: notificar conflicto.</w:t>
             </w:r>
-            <w:bookmarkStart w:id="22" w:name="_GoBack"/>
-            <w:bookmarkEnd w:id="22"/>
           </w:p>
           <w:p>
             <w:pPr>
@@ -8957,6 +9243,7 @@
               <w:spacing w:after="160" w:line="276" w:lineRule="auto"/>
             </w:pPr>
             <w:r>
+              <w:lastRenderedPageBreak/>
               <w:t>Eliminación accidental del responsable: permitir reasignación inmediata.</w:t>
             </w:r>
           </w:p>
@@ -9449,7 +9736,6 @@
                 <w:b/>
                 <w:bCs/>
               </w:rPr>
-              <w:lastRenderedPageBreak/>
               <w:t>Entrada:</w:t>
             </w:r>
           </w:p>
@@ -9623,6 +9909,7 @@
                 <w:b/>
                 <w:bCs/>
               </w:rPr>
+              <w:lastRenderedPageBreak/>
               <w:t>Descripción:</w:t>
             </w:r>
             <w:r>
@@ -11419,7 +11706,6 @@
                 <w:tag w:val="goog_rdk_0"/>
                 <w:id w:val="-324403082"/>
               </w:sdtPr>
-              <w:sdtEndPr/>
               <w:sdtContent>
                 <w:r>
                   <w:rPr>
@@ -11454,7 +11740,6 @@
                 <w:tag w:val="goog_rdk_1"/>
                 <w:id w:val="-1875049261"/>
               </w:sdtPr>
-              <w:sdtEndPr/>
               <w:sdtContent>
                 <w:r>
                   <w:rPr>
@@ -11489,7 +11774,6 @@
                 <w:tag w:val="goog_rdk_2"/>
                 <w:id w:val="-808240551"/>
               </w:sdtPr>
-              <w:sdtEndPr/>
               <w:sdtContent>
                 <w:r>
                   <w:rPr>
@@ -11524,7 +11808,6 @@
                 <w:tag w:val="goog_rdk_3"/>
                 <w:id w:val="1207897113"/>
               </w:sdtPr>
-              <w:sdtEndPr/>
               <w:sdtContent>
                 <w:r>
                   <w:rPr>
@@ -11555,7 +11838,6 @@
                 <w:tag w:val="goog_rdk_4"/>
                 <w:id w:val="-319905791"/>
               </w:sdtPr>
-              <w:sdtEndPr/>
               <w:sdtContent>
                 <w:r>
                   <w:rPr>
@@ -11688,8 +11970,8 @@
           <w:szCs w:val="22"/>
         </w:rPr>
       </w:pPr>
-      <w:bookmarkStart w:id="23" w:name="_heading=h.mqtnkfq6ctq7" w:colFirst="0" w:colLast="0"/>
-      <w:bookmarkEnd w:id="23"/>
+      <w:bookmarkStart w:id="22" w:name="_heading=h.mqtnkfq6ctq7" w:colFirst="0" w:colLast="0"/>
+      <w:bookmarkEnd w:id="22"/>
     </w:p>
     <w:p>
       <w:pPr>
@@ -11708,8 +11990,8 @@
           <w:szCs w:val="22"/>
         </w:rPr>
       </w:pPr>
-      <w:bookmarkStart w:id="24" w:name="_heading=h.o98dbd7vydxx" w:colFirst="0" w:colLast="0"/>
-      <w:bookmarkEnd w:id="24"/>
+      <w:bookmarkStart w:id="23" w:name="_heading=h.o98dbd7vydxx" w:colFirst="0" w:colLast="0"/>
+      <w:bookmarkEnd w:id="23"/>
       <w:r>
         <w:rPr>
           <w:sz w:val="22"/>
@@ -13890,8 +14172,10 @@
               <w:br/>
             </w:r>
             <w:r>
-              <w:t>El sistema debe proteger la información de los usuarios mediante mecanismos de autenticación segura, cifrado de datos en tránsito y en reposo, y cumplimiento de normativas como GDPR o equivalentes.</w:t>
-            </w:r>
+              <w:t>El sistema debe proteger la información del usuario mediante mecanismos de autenticación seguros, cifrado de datos en tránsito y en reposo, y el cumplimiento de normativas como la Ley 1581 de 2012 (Habeas Data).</w:t>
+            </w:r>
+            <w:bookmarkStart w:id="24" w:name="_GoBack"/>
+            <w:bookmarkEnd w:id="24"/>
           </w:p>
         </w:tc>
       </w:tr>
@@ -26430,7 +26714,7 @@
       <w:rPr>
         <w:noProof/>
       </w:rPr>
-      <w:t>20</w:t>
+      <w:t>30</w:t>
     </w:r>
     <w:r>
       <w:fldChar w:fldCharType="end"/>

</xml_diff>

<commit_message>
docs(srs): align the functional requirements with the implemented system
</commit_message>
<xml_diff>
--- a/SRS.docx
+++ b/SRS.docx
@@ -2612,13 +2612,12 @@
         <w:rPr>
           <w:color w:val="000000"/>
         </w:rPr>
-        <w:t xml:space="preserve">1.5.1. </w:t>
+        <w:t>1.5.1.  Una aplicación que permite al usuario responsable configurar el umbral de consumo de cada hogar (diario o mensual) y supervisar el consumo eléctrico del mismo.</w:t>
       </w:r>
       <w:r>
         <w:rPr>
           <w:color w:val="000000"/>
         </w:rPr>
-        <w:t xml:space="preserve"> Una aplicación que permite a los usuarios registrar umbrales de consumo o establecer umbrales predeterminados y supervisar manualmente su consumo de electricidad.</w:t>
       </w:r>
     </w:p>
     <w:p>
@@ -2656,8 +2655,7 @@
         <w:rPr>
           <w:color w:val="000000"/>
         </w:rPr>
-        <w:lastRenderedPageBreak/>
-        <w:t>1.5.2. Configuración de umbrales personalizados de consumo y frecuencia de notificaciones, para alertar al usuario cuando se acerque o supere sus límites establecidos.</w:t>
+        <w:t>1.5.2. Configuración por hogar de un umbral de consumo (diario o mensual) y de los canales de notificación, para alertar al usuario cuando alcance su límite establecido.</w:t>
       </w:r>
     </w:p>
     <w:p>
@@ -5565,13 +5563,12 @@
           <w:sz w:val="20"/>
           <w:szCs w:val="20"/>
         </w:rPr>
-        <w:t>2.3.4.</w:t>
+        <w:t>2.3.4. La configuración del umbral de consumo del hogar depende de cuánta energía requiera ahorrar el usuario responsable.</w:t>
       </w:r>
       <w:r>
         <w:rPr>
           <w:color w:val="000000"/>
         </w:rPr>
-        <w:t xml:space="preserve"> El registro</w:t>
       </w:r>
       <w:r>
         <w:rPr>
@@ -5583,13 +5580,11 @@
         <w:rPr>
           <w:color w:val="000000"/>
         </w:rPr>
-        <w:t>manual de umbrales de consumo depende de cuanta energía el usuario requiera ahorrar</w:t>
       </w:r>
       <w:r>
         <w:rPr>
           <w:color w:val="000000"/>
         </w:rPr>
-        <w:t>.</w:t>
       </w:r>
     </w:p>
     <w:p>
@@ -6725,7 +6720,7 @@
         </w:rPr>
       </w:pPr>
       <w:r>
-        <w:t>El usuario podrá acceder o registrarse utilizando proveedores externos de autenticación (redes sociales), los cuales serán almacenados como parte de su configuración de usuario.</w:t>
+        <w:t>El usuario podrá registrarse o iniciar sesión con su cuenta de Google desde la versión web. En el primer acceso con Google el sistema crea la cuenta con el nombre, el apellido (cuando la cuenta de Google lo tenga), la foto y el correo ya verificado, y guarda el identificador de la cuenta de Google (google_subject). El acceso se reconoce por ese identificador y no por el correo. Si el correo ya pertenece a una cuenta registrada con contraseña, el sistema rechaza el acceso (HTTP 409) para no apropiarse de cuentas existentes. Si el servidor no tiene configurado el cliente de Google, el inicio de sesión con Google queda deshabilitado (HTTP 503).</w:t>
       </w:r>
     </w:p>
     <w:p>
@@ -7093,7 +7088,7 @@
         </w:rPr>
       </w:pPr>
       <w:r>
-        <w:t>El usuario podrá configurar los umbrales de consumo para recibir alertas y recomendaciones personalizadas. Además, el sistema incluirá umbrales por defecto preestablecidos de acuerdo con las necesidades del usuario.</w:t>
+        <w:t>El usuario responsable (OWNER) de cada hogar podrá configurar los umbrales de consumo de ese hogar, eligiendo un único periodo: diario o mensual (son mutuamente excluyentes). Los umbrales son propios de cada hogar y no globales ni por usuario, y solo el OWNER puede configurarlos; el valor debe ser mayor que cero. Además, el hogar puede usar los umbrales por defecto del sistema (6 kWh diarios y 180 kWh mensuales, configurables por el servidor) mediante un interruptor; al activarlo, el sistema restablece los límites a esos valores por defecto (limitPeriod = DAILY). Estos umbrales son la base de las alertas de límite (LIMIT) y de las recomendaciones de umbral (THRESHOLD).</w:t>
       </w:r>
     </w:p>
     <w:p>
@@ -7206,7 +7201,7 @@
         <w:spacing w:after="160"/>
       </w:pPr>
       <w:r>
-        <w:t xml:space="preserve">El usuario podrá configurar como este quiere recibirlas, si a través de notificaciones o por algún otro medio digital como el correo. </w:t>
+        <w:t>El usuario podrá elegir por qué canales desea recibir alertas y recomendaciones: correo electrónico y notificaciones push del navegador (Web Push), de forma independiente. Ambos canales están activos por defecto. La preferencia es por usuario, no por hogar, y la entrega se registra por cada mensaje enviado.</w:t>
       </w:r>
     </w:p>
     <w:p>
@@ -7232,8 +7227,7 @@
         <w:spacing w:after="160"/>
       </w:pPr>
       <w:r>
-        <w:lastRenderedPageBreak/>
-        <w:t>El sistema debe contar con una configuración global predefinida que establezca valores por defecto como límites de consumo, idioma y notificaciones, los cuales podrán ser utilizados como base para la configuración individual de cada usuario.</w:t>
+        <w:t>El sistema dispondrá de una configuración global de parámetros nombre/valor (security_configuration), de una política de contraseñas predefinida y de los umbrales de consumo por defecto (home.defaults.daily-limit = 6 kWh y home.defaults.monthly-limit = 180 kWh), administradas por el servidor. El idioma, el tema de colores y las preferencias de notificación son individuales por usuario. Los límites de cada hogar pueden usar o restablecer estos valores por defecto (ver ERF3.1).</w:t>
       </w:r>
     </w:p>
     <w:p>
@@ -7306,7 +7300,7 @@
         </w:rPr>
       </w:pPr>
       <w:r>
-        <w:t>El sistema debe registrar automáticamente el consumo eléctrico proveniente de los dispositivos conectados de manera parametrizable por el usuario.</w:t>
+        <w:t>El sistema debe registrar automáticamente el consumo eléctrico proveniente de los dispositivos vinculados, recibiendo una medición cada 60 segundos.</w:t>
       </w:r>
     </w:p>
     <w:p>
@@ -7462,7 +7456,7 @@
         <w:ind w:left="2148"/>
       </w:pPr>
       <w:r>
-        <w:t>El sistema debe generar alertas automáticamente a partir del análisis de las mediciones recibidas, mediante mecanismos internos que evalúan los niveles de consumo en tiempo real.</w:t>
+        <w:t>El sistema debe generar alertas automáticamente a partir de las mediciones y del estado de los dispositivos, con cuatro tipos: THRESHOLD (una medición alcanza un nivel de consumo HIGH o CRITICAL según el umbral), CONNECTIVITY (el dispositivo deja de reportar), DEVICE (informativa: un dispositivo vinculado envió su primera lectura) y LIMIT (el hogar alcanzó su límite diario o mensual configurado).</w:t>
       </w:r>
       <w:r>
         <w:tab/>
@@ -7488,16 +7482,12 @@
         <w:spacing w:after="160"/>
       </w:pPr>
       <w:r>
-        <w:t xml:space="preserve">El usuario podrá visualizar las alertas generadas por el sistema y resolverlas dependiendo de la notificación que se </w:t>
+        <w:t>El usuario podrá visualizar las alertas generadas por el sistema. Las alertas de tipo THRESHOLD, CONNECTIVITY y LIMIT se resuelven automáticamente cuando la condición desaparece (consumo normalizado, dispositivo reconectado o nuevo periodo / límite elevado), mientras que las alertas de tipo DEVICE son informativas y el usuario las marca como leídas. Cada alerta se entrega además por correo y notificación push según las preferencias del usuario.</w:t>
       </w:r>
       <w:proofErr w:type="spellStart"/>
-      <w:r>
-        <w:t>de</w:t>
-      </w:r>
+      <w:r/>
       <w:proofErr w:type="spellEnd"/>
-      <w:r>
-        <w:t>.</w:t>
-      </w:r>
+      <w:r/>
     </w:p>
     <w:p>
       <w:pPr>
@@ -7519,7 +7509,7 @@
         <w:spacing w:after="160"/>
       </w:pPr>
       <w:r>
-        <w:t>El sistema debe generar recomendaciones automáticas basadas en el comportamiento del consumo eléctrico detectado en las mediciones, incluso cuando no se presenten situaciones críticas.</w:t>
+        <w:t>El sistema debe generar recomendaciones automáticas evaluando periódicamente (cada hora) el consumo de cada hogar, sin depender de que existan alertas. Los tipos de recomendación son: SAVING (consumo en reposo), PEAK_HOURS (consumo concentrado en horas pico), HIGH_CONSUMPTION (un dispositivo consume más que antes), HISTORICAL_COMPARISON (la semana supera a la anterior) y THRESHOLD (proyección de superar el límite). Las recomendaciones se entregan por correo y push, y el usuario puede marcarlas como leídas.</w:t>
       </w:r>
     </w:p>
     <w:p>
@@ -7545,7 +7535,7 @@
         <w:spacing w:after="160"/>
       </w:pPr>
       <w:r>
-        <w:t>El usuario podrá visualizar las recomendaciones generadas por el sistema y marcarlas como leídas.</w:t>
+        <w:t>El usuario podrá visualizar las recomendaciones generadas por el sistema, marcarlas como leídas y eliminar las ya leídas, individualmente o todas las de un hogar.</w:t>
       </w:r>
     </w:p>
     <w:p>
@@ -7641,7 +7631,7 @@
         <w:spacing w:after="160"/>
       </w:pPr>
       <w:r>
-        <w:t>El sistema debe reconocer y autenticar dispositivos mediante un identificador único y una clave de acceso, permitiendo su vinculación segura con un proyecto.</w:t>
+        <w:t>El sistema debe reconocer y autenticar los dispositivos mediante un identificador único (device_code) y una clave de acceso (api_key), permitiendo su vinculación segura a un hogar. Solo el usuario responsable (OWNER) puede vincular, editar (tipo de electrodoméstico, nombre y ubicación) o desvincular un dispositivo, y reemitir sus credenciales para cambiar la red Wi-Fi sin generar una nueva vinculación.</w:t>
       </w:r>
     </w:p>
     <w:p>
@@ -8310,6 +8300,11 @@
               <w:t>Mensajes de confirmación o error</w:t>
             </w:r>
           </w:p>
+          <w:p>
+            <w:r>
+              <w:t>Botón de inicio de sesión con Google</w:t>
+            </w:r>
+          </w:p>
         </w:tc>
       </w:tr>
       <w:tr>
@@ -8402,6 +8397,11 @@
               <w:ind w:left="720"/>
             </w:pPr>
           </w:p>
+          <w:p>
+            <w:r>
+              <w:t>Código de autorización de Google (inicio de sesión con Google).</w:t>
+            </w:r>
+          </w:p>
         </w:tc>
         <w:tc>
           <w:tcPr>
@@ -8474,6 +8474,11 @@
             </w:r>
           </w:p>
           <w:p/>
+          <w:p>
+            <w:r>
+              <w:t>Cuenta creada o sesión iniciada con Google.</w:t>
+            </w:r>
+          </w:p>
         </w:tc>
       </w:tr>
       <w:tr>
@@ -8507,7 +8512,7 @@
               <w:br/>
             </w:r>
             <w:r>
-              <w:t>El sistema debe gestionar el registro, autenticación y administración de usuarios, permitiendo el acceso tanto desde la versión web como desde la aplicación móvil. Debe incluir funcionalidades para actualización de perfil, recuperación de contraseña mediante métodos seguros y autenticación con redes sociales. Además, el usuario deberá aceptar términos, condiciones y permisos requeridos para el uso del sistema.</w:t>
+              <w:t>El sistema debe gestionar el registro, autenticación y administración de usuarios, permitiendo el acceso tanto desde la versión web como desde la aplicación móvil. Debe incluir funcionalidades para actualización de perfil, recuperación de contraseña mediante métodos seguros y autenticación con redes sociales. Además, el usuario deberá aceptar términos, condiciones y permisos requeridos para el uso del sistema. El inicio de sesión con redes sociales se realiza con Google: en el primer acceso el sistema crea la cuenta con los datos verificados de Google y, si el correo ya pertenece a una cuenta con contraseña, rechaza el acceso para no apropiarse de cuentas existentes.</w:t>
             </w:r>
           </w:p>
         </w:tc>
@@ -8588,6 +8593,11 @@
             </w:r>
           </w:p>
           <w:p/>
+          <w:p>
+            <w:r>
+              <w:t>Correo ya registrado con contraseña e intento con Google: se rechaza (HTTP 409). Inicio de sesión con Google no configurado: se informa (HTTP 503).</w:t>
+            </w:r>
+          </w:p>
         </w:tc>
       </w:tr>
     </w:tbl>
@@ -9615,96 +9625,29 @@
             </w:r>
           </w:p>
           <w:p>
-            <w:pPr>
-              <w:widowControl/>
-              <w:numPr>
-                <w:ilvl w:val="0"/>
-                <w:numId w:val="27"/>
-              </w:numPr>
-              <w:spacing w:after="160" w:line="276" w:lineRule="auto"/>
-              <w:rPr>
-                <w:b/>
-                <w:bCs/>
-              </w:rPr>
-            </w:pPr>
-            <w:r>
-              <w:t>Pantalla de configuración global del sistema</w:t>
-            </w:r>
-          </w:p>
-          <w:p>
-            <w:pPr>
-              <w:widowControl/>
-              <w:numPr>
-                <w:ilvl w:val="0"/>
-                <w:numId w:val="27"/>
-              </w:numPr>
-              <w:spacing w:after="160" w:line="276" w:lineRule="auto"/>
-              <w:rPr>
-                <w:b/>
-                <w:bCs/>
-              </w:rPr>
-            </w:pPr>
+            <w:r>
+              <w:t>Pantalla de configuración de la cuenta</w:t>
+            </w:r>
+          </w:p>
+          <w:p>
             <w:r>
               <w:t>Selección de idioma</w:t>
             </w:r>
           </w:p>
           <w:p>
-            <w:pPr>
-              <w:widowControl/>
-              <w:numPr>
-                <w:ilvl w:val="0"/>
-                <w:numId w:val="27"/>
-              </w:numPr>
-              <w:spacing w:after="160" w:line="276" w:lineRule="auto"/>
-              <w:rPr>
-                <w:b/>
-                <w:bCs/>
-              </w:rPr>
-            </w:pPr>
             <w:r>
               <w:t>Selección de tema/colores</w:t>
             </w:r>
           </w:p>
           <w:p>
-            <w:pPr>
-              <w:widowControl/>
-              <w:numPr>
-                <w:ilvl w:val="0"/>
-                <w:numId w:val="27"/>
-              </w:numPr>
-              <w:spacing w:after="160" w:line="276" w:lineRule="auto"/>
-              <w:rPr>
-                <w:b/>
-                <w:bCs/>
-              </w:rPr>
-            </w:pPr>
-            <w:r>
-              <w:t>Selección de envió de alertas</w:t>
-            </w:r>
-          </w:p>
-          <w:p>
-            <w:pPr>
-              <w:widowControl/>
-              <w:numPr>
-                <w:ilvl w:val="0"/>
-                <w:numId w:val="27"/>
-              </w:numPr>
-              <w:spacing w:after="160" w:line="276" w:lineRule="auto"/>
-              <w:rPr>
-                <w:b/>
-                <w:bCs/>
-              </w:rPr>
-            </w:pPr>
-            <w:r>
-              <w:t>Panel de configuración de umbrales</w:t>
-            </w:r>
-          </w:p>
-          <w:p>
-            <w:pPr>
-              <w:widowControl/>
-              <w:spacing w:after="160" w:line="276" w:lineRule="auto"/>
-              <w:ind w:left="720"/>
-            </w:pPr>
+            <w:r>
+              <w:t>Selección de envío de alertas (correo y push)</w:t>
+            </w:r>
+          </w:p>
+          <w:p>
+            <w:r>
+              <w:t>Panel de umbrales del hogar (solo OWNER, límite personalizado o por defecto)</w:t>
+            </w:r>
           </w:p>
         </w:tc>
       </w:tr>
@@ -9740,61 +9683,25 @@
             </w:r>
           </w:p>
           <w:p>
-            <w:pPr>
-              <w:numPr>
-                <w:ilvl w:val="0"/>
-                <w:numId w:val="33"/>
-              </w:numPr>
-            </w:pPr>
-            <w:r>
-              <w:t>Umbrales personalizados.</w:t>
-            </w:r>
-          </w:p>
-          <w:p>
-            <w:pPr>
-              <w:numPr>
-                <w:ilvl w:val="0"/>
-                <w:numId w:val="33"/>
-              </w:numPr>
-            </w:pPr>
+            <w:r>
+              <w:t>Umbral personalizado del hogar (diario o mensual) o uso de los umbrales por defecto del sistema.</w:t>
+            </w:r>
+          </w:p>
+          <w:p>
             <w:r>
               <w:t>Selección de paleta de colores.</w:t>
             </w:r>
           </w:p>
           <w:p>
-            <w:pPr>
-              <w:numPr>
-                <w:ilvl w:val="0"/>
-                <w:numId w:val="33"/>
-              </w:numPr>
-            </w:pPr>
             <w:r>
               <w:t>Idioma del sistema.</w:t>
             </w:r>
           </w:p>
           <w:p>
-            <w:pPr>
-              <w:numPr>
-                <w:ilvl w:val="0"/>
-                <w:numId w:val="33"/>
-              </w:numPr>
-            </w:pPr>
-            <w:r>
-              <w:t>Preferencias de notificaciones (app, correo, ambos).</w:t>
-            </w:r>
-          </w:p>
-          <w:p>
-            <w:pPr>
-              <w:numPr>
-                <w:ilvl w:val="0"/>
-                <w:numId w:val="33"/>
-              </w:numPr>
-            </w:pPr>
-            <w:r>
-              <w:t>Ajuste de valores por defecto</w:t>
-            </w:r>
-          </w:p>
-          <w:p/>
+            <w:r>
+              <w:t>Preferencias de notificaciones (correo, push o ambos).</w:t>
+            </w:r>
+          </w:p>
         </w:tc>
         <w:tc>
           <w:tcPr>
@@ -9823,69 +9730,30 @@
             </w:r>
           </w:p>
           <w:p>
-            <w:pPr>
-              <w:numPr>
-                <w:ilvl w:val="0"/>
-                <w:numId w:val="35"/>
-              </w:numPr>
-            </w:pPr>
             <w:r>
               <w:t>Configuraciones guardadas.</w:t>
             </w:r>
           </w:p>
           <w:p>
-            <w:pPr>
-              <w:numPr>
-                <w:ilvl w:val="0"/>
-                <w:numId w:val="35"/>
-              </w:numPr>
-            </w:pPr>
             <w:r>
               <w:t>Cambio de idioma del sistema</w:t>
             </w:r>
           </w:p>
           <w:p>
-            <w:pPr>
-              <w:numPr>
-                <w:ilvl w:val="0"/>
-                <w:numId w:val="35"/>
-              </w:numPr>
-            </w:pPr>
             <w:r>
               <w:t>Ajuste visual aplicado al sistema.</w:t>
             </w:r>
           </w:p>
           <w:p>
-            <w:pPr>
-              <w:numPr>
-                <w:ilvl w:val="0"/>
-                <w:numId w:val="35"/>
-              </w:numPr>
-            </w:pPr>
-            <w:r>
-              <w:t>Alertas configuradas según preferencias.</w:t>
-            </w:r>
-          </w:p>
-          <w:p>
-            <w:pPr>
-              <w:numPr>
-                <w:ilvl w:val="0"/>
-                <w:numId w:val="35"/>
-              </w:numPr>
-            </w:pPr>
-            <w:r>
-              <w:t>Panel de configuración de umbrales</w:t>
-            </w:r>
-          </w:p>
-          <w:p>
-            <w:pPr>
-              <w:ind w:left="720"/>
-            </w:pPr>
-            <w:r>
-              <w:t>actualizado</w:t>
-            </w:r>
-          </w:p>
-          <w:p/>
+            <w:r>
+              <w:t>Canales de notificación configurados.</w:t>
+            </w:r>
+          </w:p>
+          <w:p>
+            <w:r>
+              <w:t>Umbral del hogar actualizado o restablecido a los valores por defecto (solo OWNER)</w:t>
+            </w:r>
+          </w:p>
         </w:tc>
       </w:tr>
       <w:tr>
@@ -9912,15 +9780,10 @@
               <w:lastRenderedPageBreak/>
               <w:t>Descripción:</w:t>
             </w:r>
-            <w:r>
-              <w:rPr>
-                <w:b/>
-                <w:bCs/>
-              </w:rPr>
-              <w:br/>
-            </w:r>
-            <w:r>
-              <w:t>Este módulo permite al usuario personalizar el funcionamiento general del sistema, incluyendo umbrales de consumo eléctrico, paletas de colores adaptables al modo oscuro, idioma preferido y métodos de notificación. Su propósito es proporcionar una experiencia flexible, accesible y acorde a las necesidades individuales de cada usuario o proyecto. Estas configuraciones influyen directamente en la generación de alertas y en la visualización de la información.</w:t>
+          </w:p>
+          <w:p>
+            <w:r>
+              <w:t>Este módulo permite al usuario personalizar sus preferencias: paletas de colores adaptables al modo oscuro, idioma preferido y canales de notificación (correo y push); esta configuración es individual por usuario. Los umbrales de consumo eléctrico no son globales: se configuran por hogar y solo por su usuario responsable (OWNER), eligiendo un límite diario o mensual, y son la base de las alertas de límite y de las recomendaciones. El hogar puede restablecer sus límites a los valores por defecto del sistema mediante un interruptor.</w:t>
             </w:r>
           </w:p>
         </w:tc>
@@ -9956,65 +9819,25 @@
             </w:r>
           </w:p>
           <w:p>
-            <w:pPr>
-              <w:widowControl/>
-              <w:numPr>
-                <w:ilvl w:val="0"/>
-                <w:numId w:val="27"/>
-              </w:numPr>
-              <w:spacing w:after="160" w:line="276" w:lineRule="auto"/>
-            </w:pPr>
             <w:r>
               <w:t>Selección de idioma no disponible: mantener idioma actual.</w:t>
             </w:r>
           </w:p>
           <w:p>
-            <w:pPr>
-              <w:widowControl/>
-              <w:numPr>
-                <w:ilvl w:val="0"/>
-                <w:numId w:val="27"/>
-              </w:numPr>
-              <w:spacing w:after="160" w:line="276" w:lineRule="auto"/>
-            </w:pPr>
-            <w:r>
-              <w:t>Valores inválidos de umbrales: rechazar y solicitar corrección.</w:t>
-            </w:r>
-          </w:p>
-          <w:p>
-            <w:pPr>
-              <w:widowControl/>
-              <w:numPr>
-                <w:ilvl w:val="0"/>
-                <w:numId w:val="27"/>
-              </w:numPr>
-              <w:spacing w:after="160" w:line="276" w:lineRule="auto"/>
-            </w:pPr>
+            <w:r>
+              <w:t>Umbral inválido (menor o igual a cero o faltante): rechazar y solicitar corrección; restablecer a los valores por defecto no requiere un valor.</w:t>
+            </w:r>
+          </w:p>
+          <w:p>
             <w:r>
               <w:t>Error al guardar configuración: permitir reintento y notificar.</w:t>
             </w:r>
           </w:p>
           <w:p>
-            <w:pPr>
-              <w:widowControl/>
-              <w:numPr>
-                <w:ilvl w:val="0"/>
-                <w:numId w:val="27"/>
-              </w:numPr>
-              <w:spacing w:after="160" w:line="276" w:lineRule="auto"/>
-            </w:pPr>
             <w:r>
               <w:t>Paleta de colores incompatible: ajustar automáticamente.</w:t>
             </w:r>
           </w:p>
-          <w:p>
-            <w:pPr>
-              <w:widowControl/>
-              <w:spacing w:after="160" w:line="276" w:lineRule="auto"/>
-              <w:ind w:left="720"/>
-            </w:pPr>
-          </w:p>
-          <w:p/>
         </w:tc>
       </w:tr>
     </w:tbl>
@@ -10577,50 +10400,25 @@
             </w:r>
           </w:p>
           <w:p>
-            <w:pPr>
-              <w:numPr>
-                <w:ilvl w:val="0"/>
-                <w:numId w:val="49"/>
-              </w:numPr>
-            </w:pPr>
             <w:r>
               <w:t>Fallo en la recepción de datos: reintentar y notificar.</w:t>
             </w:r>
           </w:p>
           <w:p>
-            <w:pPr>
-              <w:numPr>
-                <w:ilvl w:val="0"/>
-                <w:numId w:val="49"/>
-              </w:numPr>
-            </w:pPr>
             <w:r>
               <w:t>Datos corruptos: descartar y registrar error.</w:t>
             </w:r>
           </w:p>
           <w:p>
-            <w:pPr>
-              <w:numPr>
-                <w:ilvl w:val="0"/>
-                <w:numId w:val="49"/>
-              </w:numPr>
-            </w:pPr>
-            <w:r>
-              <w:t>Umbral mal configurado: usar umbrales por defecto.</w:t>
-            </w:r>
-          </w:p>
-          <w:p>
-            <w:pPr>
-              <w:numPr>
-                <w:ilvl w:val="0"/>
-                <w:numId w:val="49"/>
-              </w:numPr>
-            </w:pPr>
-            <w:r>
-              <w:t>Dispositivo desconectado: generar alerta especial.</w:t>
-            </w:r>
-          </w:p>
-          <w:p/>
+            <w:r>
+              <w:t>Umbral no configurado o inválido: se solicita corregirlo; el hogar puede usar los umbrales por defecto del sistema.</w:t>
+            </w:r>
+          </w:p>
+          <w:p>
+            <w:r>
+              <w:t>Dispositivo desconectado: generar alerta automática de conectividad.</w:t>
+            </w:r>
+          </w:p>
         </w:tc>
       </w:tr>
     </w:tbl>
@@ -13304,7 +13102,7 @@
               <w:t xml:space="preserve">Requerimiento que lo utiliza o especializa: </w:t>
             </w:r>
             <w:r>
-              <w:t xml:space="preserve"> RF2, RF4, RF6</w:t>
+              <w:t xml:space="preserve"> RF2, RF4, RF5</w:t>
             </w:r>
           </w:p>
         </w:tc>
@@ -15324,7 +15122,7 @@
               <w:rPr>
                 <w:color w:val="000000"/>
               </w:rPr>
-              <w:t xml:space="preserve">El usuario podrá registrar su cuenta directamente en la página web o aplicación móvil, también tiene la opción de registrar su cuenta mediante proveedores de redes sociales, el usuario tendrá que aceptar términos y permisos dependiendo del tipo de usuario del mismo, permitiendo el tratamiento de información, y uso de la licencia del sistema </w:t>
+              <w:t>El usuario podrá registrar su cuenta directamente en la página web o aplicación móvil, también tiene la opción de registrar su cuenta o iniciar sesión mediante Google, aprovechando el correo ya verificado. El usuario tendrá que aceptar términos y permisos dependiendo del tipo de usuario del mismo, permitiendo el tratamiento de información y uso de la licencia del sistema.</w:t>
             </w:r>
           </w:p>
         </w:tc>
@@ -20305,7 +20103,7 @@
               <w:rPr>
                 <w:color w:val="000000"/>
               </w:rPr>
-              <w:t>Cambio en la configuración de umbrales</w:t>
+              <w:t>Configurar el umbral de consumo del hogar (solo OWNER)</w:t>
             </w:r>
           </w:p>
         </w:tc>
@@ -20332,7 +20130,7 @@
               <w:rPr>
                 <w:color w:val="000000"/>
               </w:rPr>
-              <w:t>El sistema se alimenta con la información del usuario, ajustando los umbrales acorde a sus necesidades.</w:t>
+              <w:t>El sistema guarda el umbral (diario o mensual) configurado por el usuario responsable del hogar.</w:t>
             </w:r>
           </w:p>
         </w:tc>
@@ -20840,7 +20638,7 @@
               <w:rPr>
                 <w:color w:val="000000"/>
               </w:rPr>
-              <w:t xml:space="preserve">Configurar valores predeterminados </w:t>
+              <w:t>Revisar la configuración vigente</w:t>
             </w:r>
           </w:p>
         </w:tc>
@@ -20870,7 +20668,7 @@
               <w:rPr>
                 <w:color w:val="000000"/>
               </w:rPr>
-              <w:t>El sistema se ajusta a sus valores por defecto.</w:t>
+              <w:t>El sistema muestra el umbral del hogar y las preferencias del usuario vigentes.</w:t>
             </w:r>
           </w:p>
         </w:tc>
@@ -26374,7 +26172,7 @@
               <w:rPr>
                 <w:color w:val="000000"/>
               </w:rPr>
-              <w:t xml:space="preserve">La transmisión se realiza mediante protocolo HTTP cada 60 segundos. </w:t>
+              <w:t xml:space="preserve">La transmisión se realiza mediante protocolo MQTT cada 60 segundos. </w:t>
             </w:r>
           </w:p>
           <w:p>
@@ -26399,7 +26197,7 @@
               <w:rPr>
                 <w:color w:val="000000"/>
               </w:rPr>
-              <w:t xml:space="preserve">Se debe garantizar seguridad en la autenticación del dispositivo. </w:t>
+              <w:t xml:space="preserve">Se debe garantizar seguridad en la autenticación del dispositivo (device_code + api_key). </w:t>
             </w:r>
           </w:p>
           <w:p>

</xml_diff>